<commit_message>
feat(security): bind decisions to the evidence set; user-journey doc; master plan v1.2
- /decide now records evidence_digest = SHA-256 over the claim's evidence
  hashes at decision time (the column Phase 3 reserved for Phase 2), returned
  in the decision view and audited with the evidence count; 3 new tests
- TENANT-004 placeholder replaced by a real cross-tenant evidence test
- docs/USER_JOURNEYS_AND_SECURITY.md: customer, insurer and attacker journeys
  mapped to endpoints, the six gates, audit events and open items
- Master plan v1.2: Phase 2 delivered state added (repo copy + README note)
- Handoff test counts refreshed (232 tests, 15 files)

Co-Authored-By: Claude Fable 5.1 <noreply@anthropic.com>
</commit_message>
<xml_diff>
--- a/docs/master-plan/EasyClaim_Cyber_Quantum_Master_Source_of_Truth.docx
+++ b/docs/master-plan/EasyClaim_Cyber_Quantum_Master_Source_of_Truth.docx
@@ -1381,6 +1381,73 @@
     </w:p>
     <w:p>
       <w:pPr>
+        <w:pStyle w:val="Heading2"/>
+      </w:pPr>
+      <w:r>
+        <w:t xml:space="preserve">Delivered — actual state after Phase 2 (2026-09-26)</w:t>
+      </w:r>
+    </w:p>
+    <w:p>
+      <w:r>
+        <w:rPr>
+          <w:rFonts w:ascii="Consolas" w:hAnsi="Consolas"/>
+          <w:sz w:val="17"/>
+        </w:rPr>
+        <w:t xml:space="preserve">Status: IMPLEMENTED on main (teammate, commits 30846ac and 43b7606). Migration 0004_evidence_security.sql. 15 new tests; main at 228 tests across 15 files after Phases 2, 3 and 4. Report: docs/phase-reports/PHASE_02_REPORT.md.</w:t>
+        <w:br/>
+        <w:t>→ queue → OCR/AI boundary → extracted signals → screening → rules/human decision</w:t>
+      </w:r>
+    </w:p>
+    <w:p>
+      <w:pPr>
+        <w:pStyle w:val="ListBullet"/>
+      </w:pPr>
+      <w:r>
+        <w:t xml:space="preserve">Upload: POST /claims/:id/evidence by the owning customer only, and only while the claim is Draft / Info Needed. PDF, JPEG or PNG up to 10 MB; the declared MIME type must match the file’s magic bytes (relabelled files → 415). Filenames are sanitised and never used in the storage key.</w:t>
+      </w:r>
+    </w:p>
+    <w:p>
+      <w:pPr>
+        <w:pStyle w:val="ListBullet"/>
+      </w:pPr>
+      <w:r>
+        <w:t xml:space="preserve">Private storage: Cloudflare R2 bucket easy-claim-evidence bound as EVIDENCE_BUCKET, no public URL; server-generated key claims/{claimId}/{uuid}. Missing binding degrades to 503, not to an unprotected path.</w:t>
+      </w:r>
+    </w:p>
+    <w:p>
+      <w:pPr>
+        <w:pStyle w:val="ListBullet"/>
+      </w:pPr>
+      <w:r>
+        <w:t xml:space="preserve">Integrity: SHA-256 per file computed server-side at upload and stored in evidence.sha256; GET …/evidence/:id/verify re-reads the object and answers VALID or TAMPERED. Since the cyber alignment follow-up, every decision also records evidence_digest = SHA-256 over the claim’s evidence hashes at decision time.</w:t>
+      </w:r>
+    </w:p>
+    <w:p>
+      <w:pPr>
+        <w:pStyle w:val="ListBullet"/>
+      </w:pPr>
+      <w:r>
+        <w:t xml:space="preserve">Authorization: list/download/verify reuse loadAuthorizedClaim (owner, or the claim’s tenant staff once submitted); another customer, another tenant, a draft or a missing claim all answer 404; evidence ids are looked up together with the claim id so they cannot be probed.</w:t>
+      </w:r>
+    </w:p>
+    <w:p>
+      <w:pPr>
+        <w:pStyle w:val="ListBullet"/>
+      </w:pPr>
+      <w:r>
+        <w:t xml:space="preserve">AI/OCR boundary: no OCR engine was built; the queue consumer validates message shape and only logs; there is no code path from evidence content or queue messages to claim state, ownership, tenant or payout (prompt-injection string test passes).</w:t>
+      </w:r>
+    </w:p>
+    <w:p>
+      <w:pPr>
+        <w:pStyle w:val="ListBullet"/>
+      </w:pPr>
+      <w:r>
+        <w:t xml:space="preserve">Not implemented / open: OCR engine and its trust boundary (BACKEND-SEC-008), malware scanning / CDR, evidence versioning, evidence deletion policy, production R2 bucket provisioning and per-environment binding.</w:t>
+      </w:r>
+    </w:p>
+    <w:p>
+      <w:pPr>
         <w:pStyle w:val="Heading1"/>
       </w:pPr>
       <w:r>
@@ -2212,7 +2279,7 @@
         <w:pStyle w:val="ListBullet"/>
       </w:pPr>
       <w:r>
-        <w:t>NIST SSDF SP 800-218 v1.1 for secure software-development practices.</w:t>
+        <w:t>NIST SSDF SP 800-218 v1.2 for secure software-development practices.</w:t>
       </w:r>
     </w:p>
     <w:p>

</xml_diff>

<commit_message>
feat(security): Phase 5 ML-DSA-65 post-quantum decision integrity
- Every decision signed with ML-DSA-65 (NIST FIPS 204, @noble/post-quantum 0.7.1)
  over a canonical bundle: outcome, reason, amounts, destination hash, evidence
  digest, screening signal, actor, time, rules version; FIPS 204 context string
- Signature, alg, key id and bundle digest stored with the insert-only decision
  in the same D1 batch (migration 0008)
- /pay verifies before reading any decision field; anything but VALID -> 409
  decision_integrity_failed (audited)
- GET /claims/:id/decision/verify (VALID/TAMPERED/UNSIGNED/UNKNOWN_KEY/
  UNAVAILABLE, audited) and GET /integrity/public-key
- Fail closed without MLDSA_SEED; setup:local generates it; fresh key per test run
- 18 new tests (264 total), live tamper demo, docs, Postman folder 10, OpenAPI,
  master plan v1.4

Co-Authored-By: Claude Opus 5.5 <noreply@anthropic.com>
</commit_message>
<xml_diff>
--- a/docs/master-plan/EasyClaim_Cyber_Quantum_Master_Source_of_Truth.docx
+++ b/docs/master-plan/EasyClaim_Cyber_Quantum_Master_Source_of_Truth.docx
@@ -27,7 +27,7 @@
     </w:p>
     <w:p>
       <w:r>
-        <w:t>Version 1.3 | 26 September 2026 | Phases 0–4 delivered on main or ready to merge; Phase 4 completion; baseline refreshed</w:t>
+        <w:t>Version 1.4 | 26 September 2026 | Phases 0–5 delivered (Phase 5 awaiting merge): post-quantum ML-DSA decision integrity added</w:t>
       </w:r>
     </w:p>
     <w:p>
@@ -478,7 +478,7 @@
           </w:tcPr>
           <w:p>
             <w:r>
-              <w:t>PLANNED (Phase 5): ML-DSA signature over the decision bundle; column reserved</w:t>
+              <w:t>IMPLEMENTED (Phase 5): every decision signed with ML-DSA-65 (FIPS 204); verify route; payout refuses unverifiable decisions. Key custody/rotation PLANNED</w:t>
             </w:r>
           </w:p>
         </w:tc>
@@ -1841,6 +1841,65 @@
     </w:p>
     <w:p>
       <w:pPr>
+        <w:pStyle w:val="Heading2"/>
+      </w:pPr>
+      <w:r>
+        <w:t xml:space="preserve">Delivered — Phase 5 (2026-09-26)</w:t>
+      </w:r>
+    </w:p>
+    <w:p>
+      <w:r>
+        <w:rPr>
+          <w:rFonts w:ascii="Consolas" w:hAnsi="Consolas"/>
+          <w:sz w:val="17"/>
+        </w:rPr>
+        <w:t xml:space="preserve">Status: IMPLEMENTED and TESTED on branch phase-5-pqc (awaiting merge). 264 Worker tests pass (18 new). Report: docs/phase-reports/PHASE_05_REPORT.md; design: docs/security/PQC_DECISION_INTEGRITY.md; live evidence: docs/security/evidence/PHASE_05_LIVE_DEMO.log.</w:t>
+        <w:br/>
+        <w:t>→ queue → OCR/AI boundary → extracted signals → screening → rules/human decision</w:t>
+      </w:r>
+    </w:p>
+    <w:p>
+      <w:pPr>
+        <w:pStyle w:val="ListBullet"/>
+      </w:pPr>
+      <w:r>
+        <w:t xml:space="preserve">Algorithm and library: ML-DSA-65 (NIST FIPS 204) via @noble/post-quantum 0.7.1 (pure TypeScript, MIT), with the FIPS 204 context string easyclaim/decision/v1. Public key 1952 bytes, signature 3309 bytes.</w:t>
+      </w:r>
+    </w:p>
+    <w:p>
+      <w:pPr>
+        <w:pStyle w:val="ListBullet"/>
+      </w:pPr>
+      <w:r>
+        <w:t xml:space="preserve">Signed bundle: decision id, claim, tenant, outcome, reason, previous stage, claimed and approved amounts, payout destination hash, decision-maker and role, time, rules version, evidence digest (Phase 2) and screening signal (Phase 4). Signed at /decide in the same database batch as the Review → Decision transition.</w:t>
+      </w:r>
+    </w:p>
+    <w:p>
+      <w:pPr>
+        <w:pStyle w:val="ListBullet"/>
+      </w:pPr>
+      <w:r>
+        <w:t xml:space="preserve">Enforcement: GET /claims/:id/decision/verify answers VALID / TAMPERED / UNSIGNED / UNKNOWN_KEY / UNAVAILABLE (audited); /pay refuses any decision that does not verify; without a signing key no decision is recorded (fail closed). GET /integrity/public-key publishes the key for outside verification.</w:t>
+      </w:r>
+    </w:p>
+    <w:p>
+      <w:pPr>
+        <w:pStyle w:val="ListBullet"/>
+      </w:pPr>
+      <w:r>
+        <w:t xml:space="preserve">Demonstrated: an insider who edits the approved amount directly in the database is detected (TAMPERED) and the payout is refused; attacker re-signing with another key is rejected (UNKNOWN_KEY); signatures grant no authority.</w:t>
+      </w:r>
+    </w:p>
+    <w:p>
+      <w:pPr>
+        <w:pStyle w:val="ListBullet"/>
+      </w:pPr>
+      <w:r>
+        <w:t xml:space="preserve">Key: 32-byte seed in the MLDSA_SEED Cloudflare secret, keypair derived per FIPS 204. DECISION REQUIRED / PLANNED: KMS or HSM custody, key rotation with a registry of past keys, trusted timestamps. Not claimed: that EasyClaim as a whole is quantum-safe (TLS and JWT HS256 are unchanged).</w:t>
+      </w:r>
+    </w:p>
+    <w:p>
+      <w:pPr>
         <w:pStyle w:val="Heading1"/>
       </w:pPr>
       <w:r>
@@ -2346,7 +2405,7 @@
         <w:pStyle w:val="ListBullet"/>
       </w:pPr>
       <w:r>
-        <w:t>NIST SSDF SP 800-218 v1.3 for secure software-development practices.</w:t>
+        <w:t>NIST SSDF SP 800-218 v1.4 for secure software-development practices.</w:t>
       </w:r>
     </w:p>
     <w:p>

</xml_diff>

<commit_message>
docs: master plan v1.4 records Phases 4 completion and 5 as merged
Co-Authored-By: Claude Opus 5.5 <noreply@anthropic.com>
</commit_message>
<xml_diff>
--- a/docs/master-plan/EasyClaim_Cyber_Quantum_Master_Source_of_Truth.docx
+++ b/docs/master-plan/EasyClaim_Cyber_Quantum_Master_Source_of_Truth.docx
@@ -27,7 +27,7 @@
     </w:p>
     <w:p>
       <w:r>
-        <w:t>Version 1.4 | 26 September 2026 | Phases 0–5 delivered (Phase 5 awaiting merge): post-quantum ML-DSA decision integrity added</w:t>
+        <w:t>Version 1.4 | 26 September 2026 | Phases 0–5 delivered and merged to main: post-quantum ML-DSA decision integrity added</w:t>
       </w:r>
     </w:p>
     <w:p>
@@ -262,7 +262,7 @@
           </w:tcPr>
           <w:p>
             <w:r>
-              <w:t>Phases 0–3 security implemented on main; 246 Worker tests + 27 Python tests passing on the Phase 4 completion branch</w:t>
+              <w:t>Phases 0–3 security implemented on main; 264 Worker tests + 27 Python tests passing on main (Phases 0–5)</w:t>
             </w:r>
           </w:p>
         </w:tc>
@@ -1744,7 +1744,7 @@
           <w:rFonts w:ascii="Consolas" w:hAnsi="Consolas"/>
           <w:sz w:val="17"/>
         </w:rPr>
-        <w:t xml:space="preserve">Status: IMPLEMENTED and TESTED on branch phase-4-completion (awaiting merge). 27 Python tests and 246 Worker tests pass. Report: docs/phase-reports/PHASE_04_REPORT.md; precheck: PHASE_04_COMPLETION_PRECHECK.md; live evidence: docs/quantum/evidence/PHASE_04_COMPLETION_LIVE_DEMO.log.</w:t>
+        <w:t xml:space="preserve">Status: IMPLEMENTED and TESTED; merged to main (PR #5, efccb8c). 27 Python tests and 246 Worker tests pass. Report: docs/phase-reports/PHASE_04_REPORT.md; precheck: PHASE_04_COMPLETION_PRECHECK.md; live evidence: docs/quantum/evidence/PHASE_04_COMPLETION_LIVE_DEMO.log.</w:t>
         <w:br/>
         <w:t>→ queue → OCR/AI boundary → extracted signals → screening → rules/human decision</w:t>
       </w:r>
@@ -1853,7 +1853,7 @@
           <w:rFonts w:ascii="Consolas" w:hAnsi="Consolas"/>
           <w:sz w:val="17"/>
         </w:rPr>
-        <w:t xml:space="preserve">Status: IMPLEMENTED and TESTED on branch phase-5-pqc (awaiting merge). 264 Worker tests pass (18 new). Report: docs/phase-reports/PHASE_05_REPORT.md; design: docs/security/PQC_DECISION_INTEGRITY.md; live evidence: docs/security/evidence/PHASE_05_LIVE_DEMO.log.</w:t>
+        <w:t xml:space="preserve">Status: IMPLEMENTED and TESTED; merged to main (PR #6, c86ee11). 264 Worker tests pass (18 new). Report: docs/phase-reports/PHASE_05_REPORT.md; design: docs/security/PQC_DECISION_INTEGRITY.md; live evidence: docs/security/evidence/PHASE_05_LIVE_DEMO.log.</w:t>
         <w:br/>
         <w:t>→ queue → OCR/AI boundary → extracted signals → screening → rules/human decision</w:t>
       </w:r>

</xml_diff>